<commit_message>
Remove internal pipeline/schema names across all projects for recruiter readability
- KittyHawk: removed KH_PL_Master_Main/Child, Replica_Kittyhawk, kh_core,
  I&DP, M1-M5, MPC/MPLX table names — generalized to descriptive terms
- Miles: removed replica_par/udm_core/mdm_core schema names, PAR Stuzo
- Shell DARE: removed DARE/AMDB, PREP Layer, IRM references
- Lepton: rewrote internal description to recruiter-friendly language
- Phillips66: removed VCS&O/VCO/PSX/P66/GI abbreviations
- Rackspace: removed NRD/ADLA abbreviations
- Microsoft: expanded BG Finance to Business Group Finance
- Added rule to CLAUDE.md: no internal pipeline/schema/project code names
- Re-exported Vamshi_Resume_2026.docx

Co-Authored-By: Claude Opus 4.6 (1M context) <noreply@anthropic.com>
</commit_message>
<xml_diff>
--- a/resume/Vamshi_Resume_2026.docx
+++ b/resume/Vamshi_Resume_2026.docx
@@ -2717,7 +2717,7 @@
         <w:pStyle w:val="BodyText"/>
       </w:pPr>
       <w:r>
-        <w:t xml:space="preserve">Efficient Data Extraction: Extract loyalty program data from PAR Stuzo</w:t>
+        <w:t xml:space="preserve">Efficient Data Extraction: Extract loyalty program data from vendor</w:t>
       </w:r>
       <w:r>
         <w:t xml:space="preserve"> </w:t>
@@ -2924,13 +2924,13 @@
         </w:numPr>
       </w:pPr>
       <w:r>
-        <w:t xml:space="preserve">Implemented stored procedures for merge operations across replica_par,</w:t>
-      </w:r>
-      <w:r>
-        <w:t xml:space="preserve"> </w:t>
-      </w:r>
-      <w:r>
-        <w:t xml:space="preserve">udm_core, and mdm_core schemas with comprehensive execution logging.</w:t>
+        <w:t xml:space="preserve">Implemented stored procedures for merge operations across replica,</w:t>
+      </w:r>
+      <w:r>
+        <w:t xml:space="preserve"> </w:t>
+      </w:r>
+      <w:r>
+        <w:t xml:space="preserve">core, and master data schemas with comprehensive execution logging.</w:t>
       </w:r>
     </w:p>
     <w:p>
@@ -3192,19 +3192,19 @@
         <w:t xml:space="preserve"> </w:t>
       </w:r>
       <w:r>
-        <w:t xml:space="preserve">application onto Azure Synapse (I&amp;DP platform), spanning 98 master and</w:t>
-      </w:r>
-      <w:r>
-        <w:t xml:space="preserve"> </w:t>
-      </w:r>
-      <w:r>
-        <w:t xml:space="preserve">transaction tables across two schemas — Replica_Kittyhawk (CDC replica)</w:t>
-      </w:r>
-      <w:r>
-        <w:t xml:space="preserve"> </w:t>
-      </w:r>
-      <w:r>
-        <w:t xml:space="preserve">and kh_core (curated analytical layer).</w:t>
+        <w:t xml:space="preserve">application onto Azure Synapse Analytics, spanning 98 master and</w:t>
+      </w:r>
+      <w:r>
+        <w:t xml:space="preserve"> </w:t>
+      </w:r>
+      <w:r>
+        <w:t xml:space="preserve">transaction tables across two schemas — a CDC replica layer</w:t>
+      </w:r>
+      <w:r>
+        <w:t xml:space="preserve"> </w:t>
+      </w:r>
+      <w:r>
+        <w:t xml:space="preserve">and a curated analytical layer.</w:t>
       </w:r>
     </w:p>
     <w:p>
@@ -3233,13 +3233,13 @@
         <w:t xml:space="preserve"> </w:t>
       </w:r>
       <w:r>
-        <w:t xml:space="preserve">into Replica_Kittyhawk, followed by ADF pipelines performing FULL LOAD</w:t>
-      </w:r>
-      <w:r>
-        <w:t xml:space="preserve"> </w:t>
-      </w:r>
-      <w:r>
-        <w:t xml:space="preserve">and incremental delta loads into kh_core using watermark-based change</w:t>
+        <w:t xml:space="preserve">into the replica layer, followed by ADF pipelines performing full load</w:t>
+      </w:r>
+      <w:r>
+        <w:t xml:space="preserve"> </w:t>
+      </w:r>
+      <w:r>
+        <w:t xml:space="preserve">and incremental delta loads into the curated layer using watermark-based change</w:t>
       </w:r>
       <w:r>
         <w:t xml:space="preserve"> </w:t>
@@ -3262,19 +3262,13 @@
         <w:t xml:space="preserve"> </w:t>
       </w:r>
       <w:r>
-        <w:t xml:space="preserve">transaction tables — Movement, MovementTransaction (MPC and MPLX</w:t>
-      </w:r>
-      <w:r>
-        <w:t xml:space="preserve"> </w:t>
-      </w:r>
-      <w:r>
-        <w:t xml:space="preserve">variants), InventoryHistory, InventoryForecast, and</w:t>
-      </w:r>
-      <w:r>
-        <w:t xml:space="preserve"> </w:t>
-      </w:r>
-      <w:r>
-        <w:t xml:space="preserve">BulkTransferExpense — with schema-aware column mappings.</w:t>
+        <w:t xml:space="preserve">transaction tables — movement, inventory, financial, and bulk transfer</w:t>
+      </w:r>
+      <w:r>
+        <w:t xml:space="preserve"> </w:t>
+      </w:r>
+      <w:r>
+        <w:t xml:space="preserve">transaction tables handling multiple business entity variants — with schema-aware column mappings.</w:t>
       </w:r>
     </w:p>
     <w:p>
@@ -3285,13 +3279,7 @@
         </w:numPr>
       </w:pPr>
       <w:r>
-        <w:t xml:space="preserve">Architected parent-child pipeline patterns (KH_PL_Master_Main/Child,</w:t>
-      </w:r>
-      <w:r>
-        <w:t xml:space="preserve"> </w:t>
-      </w:r>
-      <w:r>
-        <w:t xml:space="preserve">KH_PL_Transac_Delta_Main/Child) with concurrency guards, runtime</w:t>
+        <w:t xml:space="preserve">Architected parent-child pipeline patterns with concurrency guards, runtime</w:t>
       </w:r>
       <w:r>
         <w:t xml:space="preserve"> </w:t>
@@ -3320,7 +3308,7 @@
         <w:t xml:space="preserve"> </w:t>
       </w:r>
       <w:r>
-        <w:t xml:space="preserve">watermarks per table across M1-M5 master waves, ensuring idempotent</w:t>
+        <w:t xml:space="preserve">watermarks per table across multiple processing wave groups, ensuring idempotent</w:t>
       </w:r>
       <w:r>
         <w:t xml:space="preserve"> </w:t>
@@ -3360,19 +3348,19 @@
         </w:numPr>
       </w:pPr>
       <w:r>
-        <w:t xml:space="preserve">Built Power BI reporting layer on kh_core schema for CTRM analytics</w:t>
-      </w:r>
-      <w:r>
-        <w:t xml:space="preserve"> </w:t>
-      </w:r>
-      <w:r>
-        <w:t xml:space="preserve">including movement tracking, bulk transfer expense analysis, inventory</w:t>
-      </w:r>
-      <w:r>
-        <w:t xml:space="preserve"> </w:t>
-      </w:r>
-      <w:r>
-        <w:t xml:space="preserve">forecasting, and trading operations dashboards.</w:t>
+        <w:t xml:space="preserve">Built Power BI reporting layer on the curated schema for commodity</w:t>
+      </w:r>
+      <w:r>
+        <w:t xml:space="preserve"> </w:t>
+      </w:r>
+      <w:r>
+        <w:t xml:space="preserve">trading analytics including movement tracking, expense analysis,</w:t>
+      </w:r>
+      <w:r>
+        <w:t xml:space="preserve"> </w:t>
+      </w:r>
+      <w:r>
+        <w:t xml:space="preserve">inventory forecasting, and trading operations dashboards.</w:t>
       </w:r>
     </w:p>
     <w:p>
@@ -3714,7 +3702,7 @@
           <w:b/>
           <w:bCs/>
         </w:rPr>
-        <w:t xml:space="preserve">[Downstream] DARE (formerly AMDB – Fuel Rewards Program Database)</w:t>
+        <w:t xml:space="preserve">[Downstream] Fuel Rewards Data Platform</w:t>
       </w:r>
       <w:r>
         <w:rPr>
@@ -3824,7 +3812,7 @@
         <w:t xml:space="preserve"> </w:t>
       </w:r>
       <w:r>
-        <w:t xml:space="preserve">Rewards Program which is the direct beneficiary of this DARE project.</w:t>
+        <w:t xml:space="preserve">Rewards Program which is the direct beneficiary of this data platform.</w:t>
       </w:r>
     </w:p>
     <w:p>
@@ -3912,13 +3900,13 @@
         </w:numPr>
       </w:pPr>
       <w:r>
-        <w:t xml:space="preserve">Design &amp; Develop Ingestion module, process files into PREP Layer (make</w:t>
-      </w:r>
-      <w:r>
-        <w:t xml:space="preserve"> </w:t>
-      </w:r>
-      <w:r>
-        <w:t xml:space="preserve">data ready for curation)</w:t>
+        <w:t xml:space="preserve">Design &amp; Develop Ingestion module, process files into staging layer for</w:t>
+      </w:r>
+      <w:r>
+        <w:t xml:space="preserve"> </w:t>
+      </w:r>
+      <w:r>
+        <w:t xml:space="preserve">curation readiness</w:t>
       </w:r>
     </w:p>
     <w:p>
@@ -3970,7 +3958,7 @@
         <w:t xml:space="preserve"> </w:t>
       </w:r>
       <w:r>
-        <w:t xml:space="preserve">comply with Shell's IRM and GDPR/CCPA requirements.</w:t>
+        <w:t xml:space="preserve">comply with internal risk management, GDPR, and CCPA requirements.</w:t>
       </w:r>
     </w:p>
     <w:p>
@@ -3998,13 +3986,7 @@
         </w:numPr>
       </w:pPr>
       <w:r>
-        <w:t xml:space="preserve">Parallelly process ingress files and process them into PREP Layer (for</w:t>
-      </w:r>
-      <w:r>
-        <w:t xml:space="preserve"> </w:t>
-      </w:r>
-      <w:r>
-        <w:t xml:space="preserve">curation)</w:t>
+        <w:t xml:space="preserve">Parallelly process ingress files and process them into staging layer for curation</w:t>
       </w:r>
     </w:p>
     <w:p>
@@ -4032,7 +4014,7 @@
         <w:t xml:space="preserve"> </w:t>
       </w:r>
       <w:r>
-        <w:t xml:space="preserve">Information) as per IRM (Internal Risk Management Rules)</w:t>
+        <w:t xml:space="preserve">Information) as per internal risk management policies</w:t>
       </w:r>
     </w:p>
     <w:p>
@@ -4147,55 +4129,25 @@
         <w:pStyle w:val="BodyText"/>
       </w:pPr>
       <w:r>
-        <w:t xml:space="preserve">Lepton is the critical first step in operationalizing data lake which</w:t>
-      </w:r>
-      <w:r>
-        <w:t xml:space="preserve"> </w:t>
-      </w:r>
-      <w:r>
-        <w:t xml:space="preserve">gets Natural gas and Power trading data to provide a combined view of</w:t>
-      </w:r>
-      <w:r>
-        <w:t xml:space="preserve"> </w:t>
-      </w:r>
-      <w:r>
-        <w:t xml:space="preserve">PNL, Limits Exposure, Manual Risk Adjustments, Transaction limits and</w:t>
-      </w:r>
-      <w:r>
-        <w:t xml:space="preserve"> </w:t>
-      </w:r>
-      <w:r>
-        <w:t xml:space="preserve">Volumetric reporting, these reports will enable Traders with latest data</w:t>
-      </w:r>
-      <w:r>
-        <w:t xml:space="preserve"> </w:t>
-      </w:r>
-      <w:r>
-        <w:t xml:space="preserve">and have them equipped with much required digital advantage in</w:t>
-      </w:r>
-      <w:r>
-        <w:t xml:space="preserve"> </w:t>
-      </w:r>
-      <w:r>
-        <w:t xml:space="preserve">performing their day-to-day activities. Lepton not only automates data</w:t>
-      </w:r>
-      <w:r>
-        <w:t xml:space="preserve"> </w:t>
-      </w:r>
-      <w:r>
-        <w:t xml:space="preserve">ingestion but also key functionality that must accompany ingestion to</w:t>
-      </w:r>
-      <w:r>
-        <w:t xml:space="preserve"> </w:t>
-      </w:r>
-      <w:r>
-        <w:t xml:space="preserve">establish a complete foundation for analytics.  Data onboarding with</w:t>
-      </w:r>
-      <w:r>
-        <w:t xml:space="preserve"> </w:t>
-      </w:r>
-      <w:r>
-        <w:t xml:space="preserve">Lepton automates:</w:t>
+        <w:t xml:space="preserve">Built an enterprise data lake platform for natural gas and power</w:t>
+      </w:r>
+      <w:r>
+        <w:t xml:space="preserve"> </w:t>
+      </w:r>
+      <w:r>
+        <w:t xml:space="preserve">trading, providing traders with a consolidated view of P&amp;L, risk</w:t>
+      </w:r>
+      <w:r>
+        <w:t xml:space="preserve"> </w:t>
+      </w:r>
+      <w:r>
+        <w:t xml:space="preserve">exposure, transaction limits, and volumetric reporting. The platform</w:t>
+      </w:r>
+      <w:r>
+        <w:t xml:space="preserve"> </w:t>
+      </w:r>
+      <w:r>
+        <w:t xml:space="preserve">automates end-to-end data onboarding including:</w:t>
       </w:r>
     </w:p>
     <w:p>
@@ -4468,79 +4420,37 @@
         <w:pStyle w:val="BodyText"/>
       </w:pPr>
       <w:r>
-        <w:t xml:space="preserve">VCS&amp;O Optimization Engine will be a tool used every day by the value</w:t>
-      </w:r>
-      <w:r>
-        <w:t xml:space="preserve"> </w:t>
-      </w:r>
-      <w:r>
-        <w:t xml:space="preserve">chain optimization decision makers across the P66 operating functions to</w:t>
-      </w:r>
-      <w:r>
-        <w:t xml:space="preserve"> </w:t>
-      </w:r>
-      <w:r>
-        <w:t xml:space="preserve">enable better decisions for the general interest: Refinery</w:t>
-      </w:r>
-      <w:r>
-        <w:t xml:space="preserve"> </w:t>
-      </w:r>
-      <w:r>
-        <w:t xml:space="preserve">Planning Staff, Commercial Traders &amp; Schedulers, Marketing, Sales,</w:t>
-      </w:r>
-      <w:r>
-        <w:t xml:space="preserve"> </w:t>
-      </w:r>
-      <w:r>
-        <w:t xml:space="preserve">Pricing &amp; Supply Staff, VCS&amp;O Optimization Directors.  VCO Optimization</w:t>
-      </w:r>
-      <w:r>
-        <w:t xml:space="preserve"> </w:t>
-      </w:r>
-      <w:r>
-        <w:t xml:space="preserve">Engine will also leverage historical trend and performance data to</w:t>
-      </w:r>
-      <w:r>
-        <w:t xml:space="preserve"> </w:t>
-      </w:r>
-      <w:r>
-        <w:t xml:space="preserve">enable better strategic planning, while giving users from VCS&amp;O team,</w:t>
-      </w:r>
-      <w:r>
-        <w:t xml:space="preserve"> </w:t>
-      </w:r>
-      <w:r>
-        <w:t xml:space="preserve">Marketing, Refining, Midstream Strategy Directors a lot of visibility</w:t>
-      </w:r>
-      <w:r>
-        <w:t xml:space="preserve"> </w:t>
-      </w:r>
-      <w:r>
-        <w:t xml:space="preserve">around pricing. The Optimization Engine will move PSX from a</w:t>
-      </w:r>
-      <w:r>
-        <w:t xml:space="preserve"> </w:t>
-      </w:r>
-      <w:r>
-        <w:t xml:space="preserve">localized spreadsheet-based optimization culture to an on-line system</w:t>
-      </w:r>
-      <w:r>
-        <w:t xml:space="preserve"> </w:t>
-      </w:r>
-      <w:r>
-        <w:t xml:space="preserve">with consistent data, available to all users.  Major modules are GI</w:t>
-      </w:r>
-      <w:r>
-        <w:t xml:space="preserve"> </w:t>
-      </w:r>
-      <w:r>
-        <w:t xml:space="preserve">Margin Tool, Crude Placement/Consumption Dashboard, Historical and</w:t>
-      </w:r>
-      <w:r>
-        <w:t xml:space="preserve"> </w:t>
-      </w:r>
-      <w:r>
-        <w:t xml:space="preserve">Forecast Market Pricing Data, Inter-Month Product Demand Forecasting.</w:t>
+        <w:t xml:space="preserve">Built a value chain supply optimization platform for daily use by</w:t>
+      </w:r>
+      <w:r>
+        <w:t xml:space="preserve"> </w:t>
+      </w:r>
+      <w:r>
+        <w:t xml:space="preserve">refinery planning, commercial trading, marketing, and pricing teams.</w:t>
+      </w:r>
+      <w:r>
+        <w:t xml:space="preserve"> </w:t>
+      </w:r>
+      <w:r>
+        <w:t xml:space="preserve">The platform replaced spreadsheet-based optimization with a centralized</w:t>
+      </w:r>
+      <w:r>
+        <w:t xml:space="preserve"> </w:t>
+      </w:r>
+      <w:r>
+        <w:t xml:space="preserve">system providing consistent data and analytics. Key modules include</w:t>
+      </w:r>
+      <w:r>
+        <w:t xml:space="preserve"> </w:t>
+      </w:r>
+      <w:r>
+        <w:t xml:space="preserve">margin analysis, crude placement dashboards, market pricing forecasts,</w:t>
+      </w:r>
+      <w:r>
+        <w:t xml:space="preserve"> </w:t>
+      </w:r>
+      <w:r>
+        <w:t xml:space="preserve">and inter-month product demand forecasting.</w:t>
       </w:r>
     </w:p>
     <w:p>
@@ -4954,19 +4864,19 @@
         <w:pStyle w:val="BodyText"/>
       </w:pPr>
       <w:r>
-        <w:t xml:space="preserve">Currently NRD project resides in SQL Server, Scope of this new project</w:t>
-      </w:r>
-      <w:r>
-        <w:t xml:space="preserve"> </w:t>
-      </w:r>
-      <w:r>
-        <w:t xml:space="preserve">is to re-design the dataset keeping the downstream unaffected in Azure</w:t>
-      </w:r>
-      <w:r>
-        <w:t xml:space="preserve"> </w:t>
-      </w:r>
-      <w:r>
-        <w:t xml:space="preserve">Data Warehouse as a separate database.</w:t>
+        <w:t xml:space="preserve">Migrated an on-premises net revenue analytics dataset from SQL Server</w:t>
+      </w:r>
+      <w:r>
+        <w:t xml:space="preserve"> </w:t>
+      </w:r>
+      <w:r>
+        <w:t xml:space="preserve">to Azure Data Warehouse while maintaining downstream reporting</w:t>
+      </w:r>
+      <w:r>
+        <w:t xml:space="preserve"> </w:t>
+      </w:r>
+      <w:r>
+        <w:t xml:space="preserve">compatibility.</w:t>
       </w:r>
     </w:p>
     <w:p>
@@ -5056,19 +4966,19 @@
         </w:numPr>
       </w:pPr>
       <w:r>
-        <w:t xml:space="preserve">Exploring the load performances between ADLA, DF Pipelines along with</w:t>
-      </w:r>
-      <w:r>
-        <w:t xml:space="preserve"> </w:t>
-      </w:r>
-      <w:r>
-        <w:t xml:space="preserve">Native SSIS ETL packages and accessing the migration of objects from</w:t>
-      </w:r>
-      <w:r>
-        <w:t xml:space="preserve"> </w:t>
-      </w:r>
-      <w:r>
-        <w:t xml:space="preserve">On-Premises to Azure Data Lake.</w:t>
+        <w:t xml:space="preserve">Benchmarked load performance across Azure Data Lake Analytics, Data</w:t>
+      </w:r>
+      <w:r>
+        <w:t xml:space="preserve"> </w:t>
+      </w:r>
+      <w:r>
+        <w:t xml:space="preserve">Factory pipelines, and native SSIS packages to determine optimal</w:t>
+      </w:r>
+      <w:r>
+        <w:t xml:space="preserve"> </w:t>
+      </w:r>
+      <w:r>
+        <w:t xml:space="preserve">migration strategy.</w:t>
       </w:r>
     </w:p>
     <w:p>
@@ -6080,7 +5990,7 @@
         <w:t xml:space="preserve"> </w:t>
       </w:r>
       <w:r>
-        <w:t xml:space="preserve">(OEM Activation supply chain reporting for OEM Operations, BG Finance,</w:t>
+        <w:t xml:space="preserve">(OEM Activation supply chain reporting for OEM Operations, Business Group Finance,</w:t>
       </w:r>
       <w:r>
         <w:t xml:space="preserve"> </w:t>
@@ -6144,7 +6054,7 @@
         <w:t xml:space="preserve"> </w:t>
       </w:r>
       <w:r>
-        <w:t xml:space="preserve">Microsoft OEM Operations, BG Finance, and Anti-Piracy stakeholders.</w:t>
+        <w:t xml:space="preserve">Microsoft OEM Operations, Business Group Finance, and Anti-Piracy stakeholders.</w:t>
       </w:r>
     </w:p>
     <w:p>

</xml_diff>

<commit_message>
Remove incorrect source systems from VRR, generalize KittyHawk references
- VRR #2: removed SCADA/PI Historian/SAP ERP source system names,
  replaced with 'upstream field systems'
- KittyHawk #4: removed 'KittyHawk', 'Right Angle CTRM' internal names
  from title, tech stack, and description
- Validated all Midstream/Upstream/Downstream labels (all correct)
- Re-exported Vamshi_Resume_2026.docx

Co-Authored-By: Claude Opus 4.6 (1M context) <noreply@anthropic.com>
</commit_message>
<xml_diff>
--- a/resume/Vamshi_Resume_2026.docx
+++ b/resume/Vamshi_Resume_2026.docx
@@ -2402,19 +2402,13 @@
         <w:t xml:space="preserve"> </w:t>
       </w:r>
       <w:r>
-        <w:t xml:space="preserve">ingesting well-level injection and production data from SCADA, PI</w:t>
-      </w:r>
-      <w:r>
-        <w:t xml:space="preserve"> </w:t>
-      </w:r>
-      <w:r>
-        <w:t xml:space="preserve">Historian, and SAP ERP systems via Fivetran connectors and AWS Glue</w:t>
-      </w:r>
-      <w:r>
-        <w:t xml:space="preserve"> </w:t>
-      </w:r>
-      <w:r>
-        <w:t xml:space="preserve">ETL jobs.</w:t>
+        <w:t xml:space="preserve">ingesting well-level injection and production data from upstream</w:t>
+      </w:r>
+      <w:r>
+        <w:t xml:space="preserve"> </w:t>
+      </w:r>
+      <w:r>
+        <w:t xml:space="preserve">field systems via Fivetran connectors and cloud-native ETL jobs.</w:t>
       </w:r>
     </w:p>
     <w:p>
@@ -3100,39 +3094,25 @@
           <w:b/>
           <w:bCs/>
         </w:rPr>
-        <w:t xml:space="preserve">[Midstream] KittyHawk Modernization – Right Angle CTRM Data Platform</w:t>
-      </w:r>
+        <w:t xml:space="preserve">[Midstream] Commodity Trading Data Platform Modernization –</w:t>
+      </w:r>
+      <w:r>
+        <w:t xml:space="preserve"> </w:t>
+      </w:r>
+      <w:r>
+        <w:t xml:space="preserve">Jul 2023 – Dec 2023</w:t>
+      </w:r>
+    </w:p>
+    <w:p>
+      <w:pPr>
+        <w:pStyle w:val="BodyText"/>
+      </w:pPr>
       <w:r>
         <w:rPr>
           <w:b/>
           <w:bCs/>
         </w:rPr>
-        <w:t xml:space="preserve"> </w:t>
-      </w:r>
-      <w:r>
-        <w:rPr>
-          <w:b/>
-          <w:bCs/>
-        </w:rPr>
-        <w:t xml:space="preserve">–</w:t>
-      </w:r>
-      <w:r>
-        <w:t xml:space="preserve"> </w:t>
-      </w:r>
-      <w:r>
-        <w:t xml:space="preserve">Jul 2023 – Dec 2023</w:t>
-      </w:r>
-    </w:p>
-    <w:p>
-      <w:pPr>
-        <w:pStyle w:val="BodyText"/>
-      </w:pPr>
-      <w:r>
-        <w:rPr>
-          <w:b/>
-          <w:bCs/>
-        </w:rPr>
-        <w:t xml:space="preserve">Technologies/Stack used: Right Angle (CTRM), Qlik Replication, Azure</w:t>
+        <w:t xml:space="preserve">Technologies/Stack used: Qlik Replication, Azure</w:t>
       </w:r>
       <w:r>
         <w:rPr>
@@ -3186,13 +3166,13 @@
         <w:t xml:space="preserve"> </w:t>
       </w:r>
       <w:r>
-        <w:t xml:space="preserve">SQL Server (KittyHawk) receiving data from the Right Angle CTRM</w:t>
-      </w:r>
-      <w:r>
-        <w:t xml:space="preserve"> </w:t>
-      </w:r>
-      <w:r>
-        <w:t xml:space="preserve">application onto Azure Synapse Analytics, spanning 98 master and</w:t>
+        <w:t xml:space="preserve">commodity trading SQL Server database onto Azure Synapse Analytics,</w:t>
+      </w:r>
+      <w:r>
+        <w:t xml:space="preserve"> </w:t>
+      </w:r>
+      <w:r>
+        <w:t xml:space="preserve">spanning 98 master and</w:t>
       </w:r>
       <w:r>
         <w:t xml:space="preserve"> </w:t>

</xml_diff>

<commit_message>
Resume header: move contact info to upper right using table layout
- Name and title on left, phone/email/LinkedIn/GitHub on right
- Re-exported Vamshi_Resume_2026.docx

Co-Authored-By: Claude Opus 4.6 (1M context) <noreply@anthropic.com>
</commit_message>
<xml_diff>
--- a/resume/Vamshi_Resume_2026.docx
+++ b/resume/Vamshi_Resume_2026.docx
@@ -2,169 +2,9 @@
 <file path=word/document.xml><?xml version="1.0" encoding="utf-8"?>
 <w:document xmlns:w="http://schemas.openxmlformats.org/wordprocessingml/2006/main" xmlns:m="http://schemas.openxmlformats.org/officeDocument/2006/math" xmlns:r="http://schemas.openxmlformats.org/officeDocument/2006/relationships" xmlns:o="urn:schemas-microsoft-com:office:office" xmlns:v="urn:schemas-microsoft-com:vml" xmlns:w10="urn:schemas-microsoft-com:office:word" xmlns:a="http://schemas.openxmlformats.org/drawingml/2006/main" xmlns:pic="http://schemas.openxmlformats.org/drawingml/2006/picture" xmlns:wp="http://schemas.openxmlformats.org/drawingml/2006/wordprocessingDrawing">
   <w:body>
-    <w:bookmarkStart w:id="18" w:name="vamshi-singam"/>
-    <w:p>
-      <w:pPr>
-        <w:pStyle w:val="Heading1"/>
-      </w:pPr>
-      <w:r>
-        <w:t xml:space="preserve">Vamshi Singam</w:t>
-      </w:r>
-    </w:p>
     <w:p>
       <w:pPr>
         <w:pStyle w:val="FirstParagraph"/>
-      </w:pPr>
-      <w:r>
-        <w:rPr>
-          <w:b/>
-          <w:bCs/>
-        </w:rPr>
-        <w:t xml:space="preserve">Lead Data Engineer | Agentic AI Solutions Architect</w:t>
-      </w:r>
-    </w:p>
-    <w:p>
-      <w:pPr>
-        <w:pStyle w:val="BodyText"/>
-      </w:pPr>
-      <w:r>
-        <w:rPr>
-          <w:b/>
-          <w:bCs/>
-        </w:rPr>
-        <w:t xml:space="preserve">+1 346-666-1192</w:t>
-      </w:r>
-    </w:p>
-    <w:p>
-      <w:pPr>
-        <w:pStyle w:val="BodyText"/>
-      </w:pPr>
-      <w:hyperlink r:id="rId9">
-        <w:r>
-          <w:rPr>
-            <w:rStyle w:val="Hyperlink"/>
-          </w:rPr>
-          <w:t xml:space="preserve">vamshi455@gmail.com</w:t>
-        </w:r>
-      </w:hyperlink>
-    </w:p>
-    <w:p>
-      <w:pPr>
-        <w:pStyle w:val="BodyText"/>
-      </w:pPr>
-      <w:hyperlink r:id="rId13">
-        <w:r>
-          <w:drawing>
-            <wp:inline>
-              <wp:extent cx="542925" cy="190500"/>
-              <wp:effectExtent b="0" l="0" r="0" t="0"/>
-              <wp:docPr descr="LinkedIn" title="" id="11" name="Picture"/>
-              <a:graphic>
-                <a:graphicData uri="http://schemas.openxmlformats.org/drawingml/2006/picture">
-                  <pic:pic>
-                    <pic:nvPicPr>
-                      <pic:cNvPr descr="https://img.shields.io/badge/LinkedIn-0A66C2?logo=linkedin&amp;logoColor=white" id="12" name="Picture"/>
-                      <pic:cNvPicPr>
-                        <a:picLocks noChangeArrowheads="1" noChangeAspect="1"/>
-                      </pic:cNvPicPr>
-                    </pic:nvPicPr>
-                    <pic:blipFill>
-                      <a:blip>
-                        <a:extLst>
-                          <a:ext uri="{28A0092B-C50C-407E-A947-70E740481C1C}">
-                            <a14:useLocalDpi xmlns:a14="http://schemas.microsoft.com/office/drawing/2010/main" val="0"/>
-                          </a:ext>
-                          <a:ext uri="{96DAC541-7B7A-43D3-8B79-37D633B846F1}">
-                            <asvg:svgBlip xmlns:asvg="http://schemas.microsoft.com/office/drawing/2016/SVG/main" r:embed="rId10"/>
-                          </a:ext>
-                        </a:extLst>
-                      </a:blip>
-                      <a:stretch>
-                        <a:fillRect/>
-                      </a:stretch>
-                    </pic:blipFill>
-                    <pic:spPr bwMode="auto">
-                      <a:xfrm>
-                        <a:off x="0" y="0"/>
-                        <a:ext cx="542925" cy="190500"/>
-                      </a:xfrm>
-                      <a:prstGeom prst="rect">
-                        <a:avLst/>
-                      </a:prstGeom>
-                      <a:noFill/>
-                      <a:ln w="9525">
-                        <a:noFill/>
-                        <a:headEnd/>
-                        <a:tailEnd/>
-                      </a:ln>
-                    </pic:spPr>
-                  </pic:pic>
-                </a:graphicData>
-              </a:graphic>
-            </wp:inline>
-          </w:drawing>
-        </w:r>
-      </w:hyperlink>
-      <w:r>
-        <w:t xml:space="preserve"> </w:t>
-      </w:r>
-      <w:hyperlink r:id="rId17">
-        <w:r>
-          <w:drawing>
-            <wp:inline>
-              <wp:extent cx="619125" cy="190500"/>
-              <wp:effectExtent b="0" l="0" r="0" t="0"/>
-              <wp:docPr descr="GitHub" title="" id="15" name="Picture"/>
-              <a:graphic>
-                <a:graphicData uri="http://schemas.openxmlformats.org/drawingml/2006/picture">
-                  <pic:pic>
-                    <pic:nvPicPr>
-                      <pic:cNvPr descr="https://img.shields.io/badge/GitHub-181717?logo=github&amp;logoColor=white" id="16" name="Picture"/>
-                      <pic:cNvPicPr>
-                        <a:picLocks noChangeArrowheads="1" noChangeAspect="1"/>
-                      </pic:cNvPicPr>
-                    </pic:nvPicPr>
-                    <pic:blipFill>
-                      <a:blip>
-                        <a:extLst>
-                          <a:ext uri="{28A0092B-C50C-407E-A947-70E740481C1C}">
-                            <a14:useLocalDpi xmlns:a14="http://schemas.microsoft.com/office/drawing/2010/main" val="0"/>
-                          </a:ext>
-                          <a:ext uri="{96DAC541-7B7A-43D3-8B79-37D633B846F1}">
-                            <asvg:svgBlip xmlns:asvg="http://schemas.microsoft.com/office/drawing/2016/SVG/main" r:embed="rId14"/>
-                          </a:ext>
-                        </a:extLst>
-                      </a:blip>
-                      <a:stretch>
-                        <a:fillRect/>
-                      </a:stretch>
-                    </pic:blipFill>
-                    <pic:spPr bwMode="auto">
-                      <a:xfrm>
-                        <a:off x="0" y="0"/>
-                        <a:ext cx="619125" cy="190500"/>
-                      </a:xfrm>
-                      <a:prstGeom prst="rect">
-                        <a:avLst/>
-                      </a:prstGeom>
-                      <a:noFill/>
-                      <a:ln w="9525">
-                        <a:noFill/>
-                        <a:headEnd/>
-                        <a:tailEnd/>
-                      </a:ln>
-                    </pic:spPr>
-                  </pic:pic>
-                </a:graphicData>
-              </a:graphic>
-            </wp:inline>
-          </w:drawing>
-        </w:r>
-      </w:hyperlink>
-    </w:p>
-    <w:p>
-      <w:pPr>
-        <w:pStyle w:val="BodyText"/>
       </w:pPr>
       <w:r>
         <w:rPr>
@@ -6324,7 +6164,6 @@
         <w:t xml:space="preserve">ASP.NET, VB.NET, SQL Server, HTML, CSS</w:t>
       </w:r>
     </w:p>
-    <w:bookmarkEnd w:id="18"/>
     <w:sectPr>
       <w:pgSz w:h="15840" w:w="12240"/>
       <w:pgMar w:bottom="576" w:footer="720" w:gutter="0" w:header="720" w:left="720" w:right="720" w:top="576"/>

</xml_diff>

<commit_message>
KittyHawk #4: add specific report names to Power BI reporting bullet
Co-Authored-By: Claude Opus 4.6 (1M context) <noreply@anthropic.com>
</commit_message>
<xml_diff>
--- a/resume/Vamshi_Resume_2026.docx
+++ b/resume/Vamshi_Resume_2026.docx
@@ -3168,19 +3168,25 @@
         </w:numPr>
       </w:pPr>
       <w:r>
-        <w:t xml:space="preserve">Built Power BI reporting layer on the curated schema for commodity</w:t>
-      </w:r>
-      <w:r>
-        <w:t xml:space="preserve"> </w:t>
-      </w:r>
-      <w:r>
-        <w:t xml:space="preserve">trading analytics including movement tracking, expense analysis,</w:t>
-      </w:r>
-      <w:r>
-        <w:t xml:space="preserve"> </w:t>
-      </w:r>
-      <w:r>
-        <w:t xml:space="preserve">inventory forecasting, and trading operations dashboards.</w:t>
+        <w:t xml:space="preserve">Built Power BI reporting layer on the curated schema delivering</w:t>
+      </w:r>
+      <w:r>
+        <w:t xml:space="preserve"> </w:t>
+      </w:r>
+      <w:r>
+        <w:t xml:space="preserve">Movement, Movement Transaction, Inventory History, Inventory Forecast,</w:t>
+      </w:r>
+      <w:r>
+        <w:t xml:space="preserve"> </w:t>
+      </w:r>
+      <w:r>
+        <w:t xml:space="preserve">and Bulk Transfer Expense reports for commodity trading analytics and</w:t>
+      </w:r>
+      <w:r>
+        <w:t xml:space="preserve"> </w:t>
+      </w:r>
+      <w:r>
+        <w:t xml:space="preserve">trading operations dashboards.</w:t>
       </w:r>
     </w:p>
     <w:p>

</xml_diff>

<commit_message>
Resume header: two-column layout with contact info top-right in docx
- Name and title left-aligned, phone/email/LinkedIn/GitHub right-aligned
- Used python-docx post-processing for proper docx table layout
- Reverted master.md to clean markdown (pandoc-compatible)

Co-Authored-By: Claude Opus 4.6 (1M context) <noreply@anthropic.com>
</commit_message>
<xml_diff>
--- a/resume/Vamshi_Resume_2026.docx
+++ b/resume/Vamshi_Resume_2026.docx
@@ -2,9 +2,118 @@
 <file path=word/document.xml><?xml version="1.0" encoding="utf-8"?>
 <w:document xmlns:w="http://schemas.openxmlformats.org/wordprocessingml/2006/main" xmlns:m="http://schemas.openxmlformats.org/officeDocument/2006/math" xmlns:r="http://schemas.openxmlformats.org/officeDocument/2006/relationships" xmlns:o="urn:schemas-microsoft-com:office:office" xmlns:v="urn:schemas-microsoft-com:vml" xmlns:w10="urn:schemas-microsoft-com:office:word" xmlns:a="http://schemas.openxmlformats.org/drawingml/2006/main" xmlns:pic="http://schemas.openxmlformats.org/drawingml/2006/picture" xmlns:wp="http://schemas.openxmlformats.org/drawingml/2006/wordprocessingDrawing">
   <w:body>
-    <w:p>
-      <w:pPr>
-        <w:pStyle w:val="FirstParagraph"/>
+    <w:tbl>
+      <w:tblPr>
+        <w:tblW w:type="auto" w:w="0"/>
+        <w:tblLayout w:type="autofit"/>
+        <w:tblLook w:firstColumn="1" w:firstRow="1" w:lastColumn="0" w:lastRow="0" w:noHBand="0" w:noVBand="1" w:val="04A0"/>
+        <w:tblBorders>
+          <w:top w:val="none" w:sz="0" w:space="0" w:color="auto"/>
+          <w:left w:val="none" w:sz="0" w:space="0" w:color="auto"/>
+          <w:bottom w:val="none" w:sz="0" w:space="0" w:color="auto"/>
+          <w:right w:val="none" w:sz="0" w:space="0" w:color="auto"/>
+          <w:insideH w:val="none" w:sz="0" w:space="0" w:color="auto"/>
+          <w:insideV w:val="none" w:sz="0" w:space="0" w:color="auto"/>
+        </w:tblBorders>
+        <w:tblW w:w="5000" w:type="pct"/>
+      </w:tblPr>
+      <w:tblGrid>
+        <w:gridCol w:w="5400"/>
+        <w:gridCol w:w="5400"/>
+      </w:tblGrid>
+      <w:tr>
+        <w:tc>
+          <w:tcPr>
+            <w:tcW w:type="dxa" w:w="5400"/>
+          </w:tcPr>
+          <w:p>
+            <w:r/>
+            <w:r>
+              <w:rPr>
+                <w:rFonts w:ascii="Calibri" w:hAnsi="Calibri"/>
+                <w:b/>
+                <w:sz w:val="32"/>
+              </w:rPr>
+              <w:t>Vamshi Singam</w:t>
+            </w:r>
+          </w:p>
+          <w:p>
+            <w:r>
+              <w:rPr>
+                <w:rFonts w:ascii="Calibri" w:hAnsi="Calibri"/>
+                <w:b/>
+                <w:sz w:val="18"/>
+              </w:rPr>
+              <w:t>Lead Data Engineer | Agentic AI Solutions Architect</w:t>
+            </w:r>
+          </w:p>
+        </w:tc>
+        <w:tc>
+          <w:tcPr>
+            <w:tcW w:type="dxa" w:w="5400"/>
+          </w:tcPr>
+          <w:p>
+            <w:pPr>
+              <w:jc w:val="right"/>
+            </w:pPr>
+            <w:r/>
+            <w:r>
+              <w:rPr>
+                <w:rFonts w:ascii="Calibri" w:hAnsi="Calibri"/>
+                <w:sz w:val="18"/>
+              </w:rPr>
+              <w:t>+1 346-666-1192</w:t>
+            </w:r>
+          </w:p>
+          <w:p>
+            <w:pPr>
+              <w:jc w:val="right"/>
+            </w:pPr>
+            <w:r>
+              <w:rPr>
+                <w:rFonts w:ascii="Calibri" w:hAnsi="Calibri"/>
+                <w:sz w:val="18"/>
+              </w:rPr>
+              <w:t>vamshi455@gmail.com</w:t>
+            </w:r>
+          </w:p>
+          <w:p>
+            <w:pPr>
+              <w:jc w:val="right"/>
+            </w:pPr>
+            <w:r>
+              <w:rPr>
+                <w:rFonts w:ascii="Calibri" w:hAnsi="Calibri"/>
+                <w:color w:val="0A66C2"/>
+                <w:sz w:val="18"/>
+                <w:u w:val="single"/>
+              </w:rPr>
+              <w:t>LinkedIn</w:t>
+            </w:r>
+            <w:r>
+              <w:rPr>
+                <w:rFonts w:ascii="Calibri" w:hAnsi="Calibri"/>
+                <w:sz w:val="18"/>
+              </w:rPr>
+              <w:t xml:space="preserve"> · </w:t>
+            </w:r>
+            <w:r>
+              <w:rPr>
+                <w:rFonts w:ascii="Calibri" w:hAnsi="Calibri"/>
+                <w:color w:val="181717"/>
+                <w:sz w:val="18"/>
+                <w:u w:val="single"/>
+              </w:rPr>
+              <w:t>GitHub</w:t>
+            </w:r>
+          </w:p>
+        </w:tc>
+      </w:tr>
+    </w:tbl>
+    <w:bookmarkStart w:id="12" w:name="vamshi-singam"/>
+    <w:p>
+      <w:pPr>
+        <w:pStyle w:val="BodyText"/>
       </w:pPr>
       <w:r>
         <w:rPr>
@@ -6170,6 +6279,7 @@
         <w:t xml:space="preserve">ASP.NET, VB.NET, SQL Server, HTML, CSS</w:t>
       </w:r>
     </w:p>
+    <w:bookmarkEnd w:id="12"/>
     <w:sectPr>
       <w:pgSz w:h="15840" w:w="12240"/>
       <w:pgMar w:bottom="576" w:footer="720" w:gutter="0" w:header="720" w:left="720" w:right="720" w:top="576"/>

</xml_diff>